<commit_message>
Fix questions-as-statements and residual ping-pong
Eleven more issues caught on this reread:
- Ch.3: "What are the locked ones." / "Was it." → ?
- Ch.4: collapse "Lv. 4." / "Yeah." / "Lv. 1." / "Yeah." into one beat
- Ch.5: "Did your panel do anything more." → ?
- Ch.7: "Did the things you remember happen." → ?
- Ch.8: kill "Yeah." after "I'm here.", merge into Drew's next line
- Ch.8: "...not-remembering thing again." → ?
- Ch.8: action beat instead of "All of it." / "All of it." echo
- Ch.8: action beat instead of doubled "Okay." after "I love you"
- Ch.8: "Should I tell Mira." → ?
- Ch.10: "is this. I mean." → "is this... I mean."

https://claude.ai/code/session_01RBh4EekgRUzvxHuB8bxYSr
</commit_message>
<xml_diff>
--- a/AI Slop Book 1.docx
+++ b/AI Slop Book 1.docx
@@ -6914,7 +6914,7 @@
         <w:rPr>
           <w:rtl w:val="0"/>
         </w:rPr>
-        <w:t xml:space="preserve">"Okay," he said. "What are the locked ones."</w:t>
+        <w:t xml:space="preserve">"Okay," he said. "What are the locked ones?"</w:t>
       </w:r>
     </w:p>
     <w:p>
@@ -8038,7 +8038,7 @@
         <w:rPr>
           <w:rtl w:val="0"/>
         </w:rPr>
-        <w:t xml:space="preserve">"Was it."</w:t>
+        <w:t xml:space="preserve">"Was it?"</w:t>
       </w:r>
     </w:p>
     <w:p>
@@ -11220,46 +11220,20 @@
         <w:rPr>
           <w:rtl w:val="0"/>
         </w:rPr>
-        <w:t xml:space="preserve">"You said you were Lv. 4."</w:t>
-      </w:r>
-    </w:p>
-    <w:p>
-      <w:pPr>
-        <w:spacing w:after="240" w:before="240" w:lineRule="auto"/>
-        <w:ind w:firstLine="0"/>
-        <w:rPr/>
-      </w:pPr>
-      <w:r>
-        <w:rPr>
-          <w:rtl w:val="0"/>
-        </w:rPr>
-        <w:t xml:space="preserve">"Yeah."</w:t>
-      </w:r>
-    </w:p>
-    <w:p>
-      <w:pPr>
-        <w:spacing w:after="240" w:before="240" w:lineRule="auto"/>
-        <w:ind w:firstLine="0"/>
-        <w:rPr/>
-      </w:pPr>
-      <w:r>
-        <w:rPr>
-          <w:rtl w:val="0"/>
-        </w:rPr>
-        <w:t xml:space="preserve">"And I'm Lv. 1."</w:t>
-      </w:r>
-    </w:p>
-    <w:p>
-      <w:pPr>
-        <w:spacing w:after="240" w:before="240" w:lineRule="auto"/>
-        <w:ind w:firstLine="0"/>
-        <w:rPr/>
-      </w:pPr>
-      <w:r>
-        <w:rPr>
-          <w:rtl w:val="0"/>
-        </w:rPr>
-        <w:t xml:space="preserve">"Yeah."</w:t>
+        <w:t xml:space="preserve">"You said you were Lv. 4. And I'm Lv. 1."</w:t>
+      </w:r>
+    </w:p>
+    <w:p>
+      <w:pPr>
+        <w:spacing w:after="240" w:before="240" w:lineRule="auto"/>
+        <w:ind w:firstLine="0"/>
+        <w:rPr/>
+      </w:pPr>
+      <w:r>
+        <w:rPr>
+          <w:rtl w:val="0"/>
+        </w:rPr>
+        <w:t xml:space="preserve">She nodded over her bowl and waited him out.</w:t>
       </w:r>
     </w:p>
     <w:p>
@@ -16631,7 +16605,7 @@
         <w:rPr>
           <w:rtl w:val="0"/>
         </w:rPr>
-        <w:t xml:space="preserve">"Did that — did your panel do anything more."</w:t>
+        <w:t xml:space="preserve">"Did that — did your panel do anything more?"</w:t>
       </w:r>
     </w:p>
     <w:p>
@@ -26805,7 +26779,7 @@
         <w:rPr>
           <w:rtl w:val="0"/>
         </w:rPr>
-        <w:t xml:space="preserve">"Did the things you remember happen."</w:t>
+        <w:t xml:space="preserve">"Did the things you remember happen?"</w:t>
       </w:r>
     </w:p>
     <w:p>
@@ -27972,33 +27946,7 @@
         <w:rPr>
           <w:rtl w:val="0"/>
         </w:rPr>
-        <w:t xml:space="preserve">"I'm here."</w:t>
-      </w:r>
-    </w:p>
-    <w:p>
-      <w:pPr>
-        <w:spacing w:after="240" w:before="240" w:lineRule="auto"/>
-        <w:ind w:firstLine="0"/>
-        <w:rPr/>
-      </w:pPr>
-      <w:r>
-        <w:rPr>
-          <w:rtl w:val="0"/>
-        </w:rPr>
-        <w:t xml:space="preserve">"Yeah."</w:t>
-      </w:r>
-    </w:p>
-    <w:p>
-      <w:pPr>
-        <w:spacing w:after="240" w:before="240" w:lineRule="auto"/>
-        <w:ind w:firstLine="0"/>
-        <w:rPr/>
-      </w:pPr>
-      <w:r>
-        <w:rPr>
-          <w:rtl w:val="0"/>
-        </w:rPr>
-        <w:t xml:space="preserve">"I'm — yeah. I'm okay. Hi. I'm okay."</w:t>
+        <w:t xml:space="preserve">"I'm here. I'm — yeah. I'm okay. Hi. I'm okay."</w:t>
       </w:r>
     </w:p>
     <w:p>
@@ -28063,7 +28011,7 @@
         <w:rPr>
           <w:rtl w:val="0"/>
         </w:rPr>
-        <w:t xml:space="preserve">"Was it the not-remembering thing again."</w:t>
+        <w:t xml:space="preserve">"Was it the not-remembering thing again?"</w:t>
       </w:r>
     </w:p>
     <w:p>
@@ -28115,6 +28063,32 @@
         <w:rPr>
           <w:rtl w:val="0"/>
         </w:rPr>
+        <w:t xml:space="preserve">Mira's hand stilled on his sternum.</w:t>
+      </w:r>
+    </w:p>
+    <w:p>
+      <w:pPr>
+        <w:spacing w:after="240" w:before="240" w:lineRule="auto"/>
+        <w:ind w:firstLine="0"/>
+        <w:rPr/>
+      </w:pPr>
+      <w:r>
+        <w:rPr>
+          <w:rtl w:val="0"/>
+        </w:rPr>
+        <w:t xml:space="preserve">"All of it?"</w:t>
+      </w:r>
+    </w:p>
+    <w:p>
+      <w:pPr>
+        <w:spacing w:after="240" w:before="240" w:lineRule="auto"/>
+        <w:ind w:firstLine="0"/>
+        <w:rPr/>
+      </w:pPr>
+      <w:r>
+        <w:rPr>
+          <w:rtl w:val="0"/>
+        </w:rPr>
         <w:t xml:space="preserve">"All of it."</w:t>
       </w:r>
     </w:p>
@@ -28128,19 +28102,6 @@
         <w:rPr>
           <w:rtl w:val="0"/>
         </w:rPr>
-        <w:t xml:space="preserve">"All of it."</w:t>
-      </w:r>
-    </w:p>
-    <w:p>
-      <w:pPr>
-        <w:spacing w:after="240" w:before="240" w:lineRule="auto"/>
-        <w:ind w:firstLine="0"/>
-        <w:rPr/>
-      </w:pPr>
-      <w:r>
-        <w:rPr>
-          <w:rtl w:val="0"/>
-        </w:rPr>
         <w:t xml:space="preserve">She was quiet for a second.</w:t>
       </w:r>
     </w:p>
@@ -28246,7 +28207,7 @@
         <w:rPr>
           <w:rtl w:val="0"/>
         </w:rPr>
-        <w:t xml:space="preserve">"Okay."</w:t>
+        <w:t xml:space="preserve">She went still under his hand for a beat.</w:t>
       </w:r>
     </w:p>
     <w:p>
@@ -29052,7 +29013,7 @@
         <w:rPr>
           <w:rtl w:val="0"/>
         </w:rPr>
-        <w:t xml:space="preserve">"Should I tell Mira."</w:t>
+        <w:t xml:space="preserve">"Should I tell Mira?"</w:t>
       </w:r>
     </w:p>
     <w:p>
@@ -33683,7 +33644,7 @@
         <w:rPr>
           <w:rtl w:val="0"/>
         </w:rPr>
-        <w:t xml:space="preserve">"Branwen, are we — is this. I mean."</w:t>
+        <w:t xml:space="preserve">"Branwen, are we — is this... I mean."</w:t>
       </w:r>
     </w:p>
     <w:p>

</xml_diff>